<commit_message>
Implementation of SolaraCore and Solara.mq5
</commit_message>
<xml_diff>
--- a/SOLARA - Functional Specification.docx
+++ b/SOLARA - Functional Specification.docx
@@ -288,7 +288,13 @@
         <w:t>──</w:t>
       </w:r>
       <w:r>
-        <w:t xml:space="preserve"> Core/</w:t>
+        <w:t xml:space="preserve"> </w:t>
+      </w:r>
+      <w:r>
+        <w:rPr>
+          <w:highlight w:val="yellow"/>
+        </w:rPr>
+        <w:t>Core/</w:t>
       </w:r>
     </w:p>
     <w:p>
@@ -856,7 +862,16 @@
         <w:t>──</w:t>
       </w:r>
       <w:r>
-        <w:t xml:space="preserve"> Execution/</w:t>
+        <w:t xml:space="preserve"> </w:t>
+      </w:r>
+      <w:r>
+        <w:rPr>
+          <w:highlight w:val="yellow"/>
+        </w:rPr>
+        <w:t>Execution</w:t>
+      </w:r>
+      <w:r>
+        <w:t>/</w:t>
       </w:r>
     </w:p>
     <w:p>
@@ -967,6 +982,9 @@
       </w:r>
       <w:proofErr w:type="spellStart"/>
       <w:r>
+        <w:rPr>
+          <w:highlight w:val="yellow"/>
+        </w:rPr>
         <w:t>MoneyManagement</w:t>
       </w:r>
       <w:proofErr w:type="spellEnd"/>
@@ -1103,7 +1121,16 @@
         <w:t>──</w:t>
       </w:r>
       <w:r>
-        <w:t xml:space="preserve"> Configuration/</w:t>
+        <w:t xml:space="preserve"> </w:t>
+      </w:r>
+      <w:r>
+        <w:rPr>
+          <w:highlight w:val="yellow"/>
+        </w:rPr>
+        <w:t>Configuration</w:t>
+      </w:r>
+      <w:r>
+        <w:t>/</w:t>
       </w:r>
     </w:p>
     <w:p>
@@ -1266,7 +1293,16 @@
         <w:t>──</w:t>
       </w:r>
       <w:r>
-        <w:t xml:space="preserve"> Utilities/</w:t>
+        <w:t xml:space="preserve"> </w:t>
+      </w:r>
+      <w:r>
+        <w:rPr>
+          <w:highlight w:val="yellow"/>
+        </w:rPr>
+        <w:t>Utilities</w:t>
+      </w:r>
+      <w:r>
+        <w:t>/</w:t>
       </w:r>
     </w:p>
     <w:p>
@@ -1423,7 +1459,16 @@
         <w:t>──</w:t>
       </w:r>
       <w:r>
-        <w:t xml:space="preserve"> Data/</w:t>
+        <w:t xml:space="preserve"> </w:t>
+      </w:r>
+      <w:r>
+        <w:rPr>
+          <w:highlight w:val="yellow"/>
+        </w:rPr>
+        <w:t>Data</w:t>
+      </w:r>
+      <w:r>
+        <w:t>/</w:t>
       </w:r>
     </w:p>
     <w:p>
@@ -1530,7 +1575,16 @@
         <w:t>──</w:t>
       </w:r>
       <w:r>
-        <w:t xml:space="preserve"> Monitoring/</w:t>
+        <w:t xml:space="preserve"> </w:t>
+      </w:r>
+      <w:r>
+        <w:rPr>
+          <w:highlight w:val="yellow"/>
+        </w:rPr>
+        <w:t>Monitoring</w:t>
+      </w:r>
+      <w:r>
+        <w:t>/</w:t>
       </w:r>
     </w:p>
     <w:p>
@@ -34350,6 +34404,7 @@
   <w:style w:type="character" w:default="1" w:styleId="DefaultParagraphFont">
     <w:name w:val="Default Paragraph Font"/>
     <w:uiPriority w:val="1"/>
+    <w:semiHidden/>
     <w:unhideWhenUsed/>
   </w:style>
   <w:style w:type="table" w:default="1" w:styleId="TableNormal">

</xml_diff>

<commit_message>
Created ML Pull Back Functional Specifications.
</commit_message>
<xml_diff>
--- a/SOLARA - Functional Specification.docx
+++ b/SOLARA - Functional Specification.docx
@@ -95,7 +95,7 @@
     <w:p>
       <w:r>
         <w:pict w14:anchorId="6A0E6DA6">
-          <v:rect id="_x0000_i1121" style="width:0;height:.75pt" o:hralign="center" o:hrstd="t" o:hr="t" fillcolor="#a0a0a0" stroked="f"/>
+          <v:rect id="_x0000_i1025" style="width:0;height:.75pt" o:hralign="center" o:hrstd="t" o:hr="t" fillcolor="#a0a0a0" stroked="f"/>
         </w:pict>
       </w:r>
     </w:p>
@@ -320,7 +320,7 @@
     <w:p>
       <w:r>
         <w:pict w14:anchorId="469160DB">
-          <v:rect id="_x0000_i1122" style="width:0;height:.75pt" o:hralign="center" o:hrstd="t" o:hr="t" fillcolor="#a0a0a0" stroked="f"/>
+          <v:rect id="_x0000_i1026" style="width:0;height:.75pt" o:hralign="center" o:hrstd="t" o:hr="t" fillcolor="#a0a0a0" stroked="f"/>
         </w:pict>
       </w:r>
     </w:p>
@@ -904,7 +904,7 @@
     <w:p>
       <w:r>
         <w:pict w14:anchorId="523D8C72">
-          <v:rect id="_x0000_i1123" style="width:0;height:.75pt" o:hralign="center" o:hrstd="t" o:hr="t" fillcolor="#a0a0a0" stroked="f"/>
+          <v:rect id="_x0000_i1027" style="width:0;height:.75pt" o:hralign="center" o:hrstd="t" o:hr="t" fillcolor="#a0a0a0" stroked="f"/>
         </w:pict>
       </w:r>
     </w:p>
@@ -1241,288 +1241,65 @@
     </w:p>
     <w:p>
       <w:r>
-        <w:t>text</w:t>
+        <w:rPr>
+          <w:noProof/>
+        </w:rPr>
+        <w:drawing>
+          <wp:inline distT="0" distB="0" distL="0" distR="0" wp14:anchorId="292FDF6D" wp14:editId="50CD1975">
+            <wp:extent cx="5943600" cy="4205605"/>
+            <wp:effectExtent l="0" t="0" r="0" b="4445"/>
+            <wp:docPr id="1513064194" name="Picture 2"/>
+            <wp:cNvGraphicFramePr>
+              <a:graphicFrameLocks xmlns:a="http://schemas.openxmlformats.org/drawingml/2006/main" noChangeAspect="1"/>
+            </wp:cNvGraphicFramePr>
+            <a:graphic xmlns:a="http://schemas.openxmlformats.org/drawingml/2006/main">
+              <a:graphicData uri="http://schemas.openxmlformats.org/drawingml/2006/picture">
+                <pic:pic xmlns:pic="http://schemas.openxmlformats.org/drawingml/2006/picture">
+                  <pic:nvPicPr>
+                    <pic:cNvPr id="1513064194" name="Picture 1513064194"/>
+                    <pic:cNvPicPr/>
+                  </pic:nvPicPr>
+                  <pic:blipFill>
+                    <a:blip r:embed="rId7" cstate="print">
+                      <a:extLst>
+                        <a:ext uri="{28A0092B-C50C-407E-A947-70E740481C1C}">
+                          <a14:useLocalDpi xmlns:a14="http://schemas.microsoft.com/office/drawing/2010/main" val="0"/>
+                        </a:ext>
+                      </a:extLst>
+                    </a:blip>
+                    <a:stretch>
+                      <a:fillRect/>
+                    </a:stretch>
+                  </pic:blipFill>
+                  <pic:spPr>
+                    <a:xfrm>
+                      <a:off x="0" y="0"/>
+                      <a:ext cx="5943600" cy="4205605"/>
+                    </a:xfrm>
+                    <a:prstGeom prst="rect">
+                      <a:avLst/>
+                    </a:prstGeom>
+                  </pic:spPr>
+                </pic:pic>
+              </a:graphicData>
+            </a:graphic>
+          </wp:inline>
+        </w:drawing>
       </w:r>
     </w:p>
     <w:p>
       <w:r>
-        <w:t>┌─────────────────────────────────────────────┐</w:t>
+        <w:pict w14:anchorId="1E41D7EB">
+          <v:rect id="_x0000_i1028" style="width:0;height:.75pt" o:hralign="center" o:hrstd="t" o:hr="t" fillcolor="#a0a0a0" stroked="f"/>
+        </w:pict>
       </w:r>
     </w:p>
     <w:p>
-      <w:r>
-        <w:t xml:space="preserve">│            Solara.mq5 (Main </w:t>
-      </w:r>
-      <w:proofErr w:type="gramStart"/>
-      <w:r>
-        <w:t xml:space="preserve">EA)   </w:t>
-      </w:r>
-      <w:proofErr w:type="gramEnd"/>
-      <w:r>
-        <w:t xml:space="preserve">          │</w:t>
-      </w:r>
-    </w:p>
-    <w:p>
-      <w:r>
-        <w:t>│    • Timer-based execution                  │</w:t>
-      </w:r>
-    </w:p>
-    <w:p>
-      <w:r>
-        <w:t>│    • User input management                  │</w:t>
-      </w:r>
-    </w:p>
-    <w:p>
-      <w:r>
-        <w:t>│    • Chart event handling                   │</w:t>
-      </w:r>
-    </w:p>
-    <w:p>
-      <w:r>
-        <w:t>└─────────────────────</w:t>
-      </w:r>
-      <w:r>
-        <w:rPr>
-          <w:rFonts w:ascii="MS Gothic" w:eastAsia="MS Gothic" w:hAnsi="MS Gothic" w:cs="MS Gothic" w:hint="eastAsia"/>
-        </w:rPr>
-        <w:t>┬</w:t>
-      </w:r>
-      <w:r>
-        <w:rPr>
-          <w:rFonts w:ascii="Aptos" w:hAnsi="Aptos" w:cs="Aptos"/>
-        </w:rPr>
-        <w:t>───────────────────────┘</w:t>
-      </w:r>
-    </w:p>
-    <w:p>
-      <w:r>
-        <w:t xml:space="preserve">                      │</w:t>
-      </w:r>
-    </w:p>
-    <w:p>
-      <w:r>
-        <w:t xml:space="preserve">        ┌─────────────</w:t>
-      </w:r>
-      <w:r>
-        <w:rPr>
-          <w:rFonts w:ascii="Arial" w:hAnsi="Arial" w:cs="Arial"/>
-        </w:rPr>
-        <w:t>▼</w:t>
-      </w:r>
-      <w:r>
-        <w:rPr>
-          <w:rFonts w:ascii="Aptos" w:hAnsi="Aptos" w:cs="Aptos"/>
-        </w:rPr>
-        <w:t>─────────────┐</w:t>
-      </w:r>
-    </w:p>
-    <w:p>
-      <w:r>
-        <w:t xml:space="preserve">        │    </w:t>
-      </w:r>
-      <w:proofErr w:type="spellStart"/>
-      <w:r>
-        <w:t>StrategyManager.mqh</w:t>
-      </w:r>
-      <w:proofErr w:type="spellEnd"/>
-      <w:r>
-        <w:t xml:space="preserve">    │</w:t>
-      </w:r>
-    </w:p>
-    <w:p>
-      <w:r>
-        <w:t xml:space="preserve">        │    • Strategy lifecycle   │</w:t>
-      </w:r>
-    </w:p>
-    <w:p>
-      <w:r>
-        <w:t xml:space="preserve">        │    • Risk coordination    │</w:t>
-      </w:r>
-    </w:p>
-    <w:p>
-      <w:r>
-        <w:t xml:space="preserve">        │    • Performance tracking │</w:t>
-      </w:r>
-    </w:p>
-    <w:p>
-      <w:r>
-        <w:t xml:space="preserve">        └─────────────</w:t>
-      </w:r>
-      <w:r>
-        <w:rPr>
-          <w:rFonts w:ascii="MS Gothic" w:eastAsia="MS Gothic" w:hAnsi="MS Gothic" w:cs="MS Gothic" w:hint="eastAsia"/>
-        </w:rPr>
-        <w:t>┬</w:t>
-      </w:r>
-      <w:r>
-        <w:rPr>
-          <w:rFonts w:ascii="Aptos" w:hAnsi="Aptos" w:cs="Aptos"/>
-        </w:rPr>
-        <w:t>─────────────┘</w:t>
-      </w:r>
-    </w:p>
-    <w:p>
+      <w:pPr>
+        <w:pStyle w:val="Heading2"/>
+      </w:pPr>
       <w:r>
         <w:lastRenderedPageBreak/>
-        <w:t xml:space="preserve">                      │</w:t>
-      </w:r>
-    </w:p>
-    <w:p>
-      <w:r>
-        <w:t xml:space="preserve">        ┌─────────────</w:t>
-      </w:r>
-      <w:r>
-        <w:rPr>
-          <w:rFonts w:ascii="Arial" w:hAnsi="Arial" w:cs="Arial"/>
-        </w:rPr>
-        <w:t>▼</w:t>
-      </w:r>
-      <w:r>
-        <w:rPr>
-          <w:rFonts w:ascii="Aptos" w:hAnsi="Aptos" w:cs="Aptos"/>
-        </w:rPr>
-        <w:t>─────────────┐</w:t>
-      </w:r>
-    </w:p>
-    <w:p>
-      <w:r>
-        <w:t xml:space="preserve">        │    </w:t>
-      </w:r>
-      <w:proofErr w:type="spellStart"/>
-      <w:r>
-        <w:t>StrategyBase.mqh</w:t>
-      </w:r>
-      <w:proofErr w:type="spellEnd"/>
-      <w:r>
-        <w:t xml:space="preserve">       │</w:t>
-      </w:r>
-    </w:p>
-    <w:p>
-      <w:r>
-        <w:t xml:space="preserve">        │ </w:t>
-      </w:r>
-      <w:proofErr w:type="gramStart"/>
-      <w:r>
-        <w:t xml:space="preserve">   (</w:t>
-      </w:r>
-      <w:proofErr w:type="gramEnd"/>
-      <w:r>
-        <w:t xml:space="preserve">Abstract </w:t>
-      </w:r>
-      <w:proofErr w:type="gramStart"/>
-      <w:r>
-        <w:t xml:space="preserve">Interface)   </w:t>
-      </w:r>
-      <w:proofErr w:type="gramEnd"/>
-      <w:r>
-        <w:t>│</w:t>
-      </w:r>
-    </w:p>
-    <w:p>
-      <w:r>
-        <w:t xml:space="preserve">        └─────────────</w:t>
-      </w:r>
-      <w:r>
-        <w:rPr>
-          <w:rFonts w:ascii="MS Gothic" w:eastAsia="MS Gothic" w:hAnsi="MS Gothic" w:cs="MS Gothic" w:hint="eastAsia"/>
-        </w:rPr>
-        <w:t>┬</w:t>
-      </w:r>
-      <w:r>
-        <w:rPr>
-          <w:rFonts w:ascii="Aptos" w:hAnsi="Aptos" w:cs="Aptos"/>
-        </w:rPr>
-        <w:t>─────────────┘</w:t>
-      </w:r>
-    </w:p>
-    <w:p>
-      <w:r>
-        <w:t xml:space="preserve">                      │</w:t>
-      </w:r>
-    </w:p>
-    <w:p>
-      <w:r>
-        <w:t xml:space="preserve">    ┌─────────────────</w:t>
-      </w:r>
-      <w:r>
-        <w:rPr>
-          <w:rFonts w:ascii="MS Gothic" w:eastAsia="MS Gothic" w:hAnsi="MS Gothic" w:cs="MS Gothic" w:hint="eastAsia"/>
-        </w:rPr>
-        <w:t>┼</w:t>
-      </w:r>
-      <w:r>
-        <w:rPr>
-          <w:rFonts w:ascii="Aptos" w:hAnsi="Aptos" w:cs="Aptos"/>
-        </w:rPr>
-        <w:t>─────────────────┐</w:t>
-      </w:r>
-    </w:p>
-    <w:p>
-      <w:r>
-        <w:t xml:space="preserve">    </w:t>
-      </w:r>
-      <w:r>
-        <w:rPr>
-          <w:rFonts w:ascii="Arial" w:hAnsi="Arial" w:cs="Arial"/>
-        </w:rPr>
-        <w:t>▼</w:t>
-      </w:r>
-      <w:r>
-        <w:t xml:space="preserve">                 </w:t>
-      </w:r>
-      <w:r>
-        <w:rPr>
-          <w:rFonts w:ascii="Arial" w:hAnsi="Arial" w:cs="Arial"/>
-        </w:rPr>
-        <w:t>▼</w:t>
-      </w:r>
-      <w:r>
-        <w:t xml:space="preserve">                 </w:t>
-      </w:r>
-      <w:r>
-        <w:rPr>
-          <w:rFonts w:ascii="Arial" w:hAnsi="Arial" w:cs="Arial"/>
-        </w:rPr>
-        <w:t>▼</w:t>
-      </w:r>
-    </w:p>
-    <w:p>
-      <w:r>
-        <w:t>┌─────────┐     ┌─────────┐     ┌─────────┐</w:t>
-      </w:r>
-    </w:p>
-    <w:p>
-      <w:r>
-        <w:t xml:space="preserve">│ EMA     │     │ PTS     │     │ </w:t>
-      </w:r>
-      <w:proofErr w:type="gramStart"/>
-      <w:r>
-        <w:t>Future  │</w:t>
-      </w:r>
-      <w:proofErr w:type="gramEnd"/>
-    </w:p>
-    <w:p>
-      <w:r>
-        <w:t>│ Strategy│     │ Strategy│     │ Strategy│</w:t>
-      </w:r>
-    </w:p>
-    <w:p>
-      <w:r>
-        <w:t>└─────────┘     └─────────┘     └─────────┘</w:t>
-      </w:r>
-    </w:p>
-    <w:p>
-      <w:r>
-        <w:pict w14:anchorId="1E41D7EB">
-          <v:rect id="_x0000_i1124" style="width:0;height:.75pt" o:hralign="center" o:hrstd="t" o:hr="t" fillcolor="#a0a0a0" stroked="f"/>
-        </w:pict>
-      </w:r>
-    </w:p>
-    <w:p>
-      <w:pPr>
-        <w:pStyle w:val="Heading2"/>
-      </w:pPr>
-      <w:r>
         <w:t>4. STRATEGY TOGGLE SYSTEM (NEW FEATURE)</w:t>
       </w:r>
     </w:p>
@@ -1674,7 +1451,6 @@
     </w:p>
     <w:p>
       <w:r>
-        <w:lastRenderedPageBreak/>
         <w:t xml:space="preserve">input double </w:t>
       </w:r>
       <w:proofErr w:type="spellStart"/>
@@ -1931,6 +1707,7 @@
           </w:tcPr>
           <w:p>
             <w:r>
+              <w:lastRenderedPageBreak/>
               <w:t>BOTH OFF</w:t>
             </w:r>
           </w:p>
@@ -2168,7 +1945,7 @@
     <w:p>
       <w:r>
         <w:pict w14:anchorId="5F05186D">
-          <v:rect id="_x0000_i1125" style="width:0;height:.75pt" o:hralign="center" o:hrstd="t" o:hr="t" fillcolor="#a0a0a0" stroked="f"/>
+          <v:rect id="_x0000_i1029" style="width:0;height:.75pt" o:hralign="center" o:hrstd="t" o:hr="t" fillcolor="#a0a0a0" stroked="f"/>
         </w:pict>
       </w:r>
     </w:p>
@@ -2206,7 +1983,6 @@
     <w:p/>
     <w:p>
       <w:r>
-        <w:lastRenderedPageBreak/>
         <w:t>// Exit Conditions:</w:t>
       </w:r>
     </w:p>
@@ -2293,8 +2069,9 @@
     </w:p>
     <w:p>
       <w:r>
+        <w:lastRenderedPageBreak/>
         <w:pict w14:anchorId="6187076E">
-          <v:rect id="_x0000_i1126" style="width:0;height:.75pt" o:hralign="center" o:hrstd="t" o:hr="t" fillcolor="#a0a0a0" stroked="f"/>
+          <v:rect id="_x0000_i1030" style="width:0;height:.75pt" o:hralign="center" o:hrstd="t" o:hr="t" fillcolor="#a0a0a0" stroked="f"/>
         </w:pict>
       </w:r>
     </w:p>
@@ -2406,7 +2183,6 @@
           </w:tcPr>
           <w:p>
             <w:r>
-              <w:lastRenderedPageBreak/>
               <w:t>Time (GMT)</w:t>
             </w:r>
           </w:p>
@@ -2638,6 +2414,7 @@
           </w:tcPr>
           <w:p>
             <w:r>
+              <w:lastRenderedPageBreak/>
               <w:t>20:00</w:t>
             </w:r>
           </w:p>
@@ -2779,7 +2556,7 @@
     <w:p>
       <w:r>
         <w:pict w14:anchorId="1434EE24">
-          <v:rect id="_x0000_i1127" style="width:0;height:.75pt" o:hralign="center" o:hrstd="t" o:hr="t" fillcolor="#a0a0a0" stroked="f"/>
+          <v:rect id="_x0000_i1031" style="width:0;height:.75pt" o:hralign="center" o:hrstd="t" o:hr="t" fillcolor="#a0a0a0" stroked="f"/>
         </w:pict>
       </w:r>
     </w:p>
@@ -2788,7 +2565,6 @@
         <w:pStyle w:val="Heading2"/>
       </w:pPr>
       <w:r>
-        <w:lastRenderedPageBreak/>
         <w:t>7. CONFIGURATION SYSTEM</w:t>
       </w:r>
     </w:p>
@@ -2881,6 +2657,7 @@
     </w:p>
     <w:p>
       <w:r>
+        <w:lastRenderedPageBreak/>
         <w:t>input group "=== EMA STRATEGY ==="</w:t>
       </w:r>
     </w:p>
@@ -3210,7 +2987,7 @@
     <w:p>
       <w:r>
         <w:pict w14:anchorId="4DA09320">
-          <v:rect id="_x0000_i1128" style="width:0;height:.75pt" o:hralign="center" o:hrstd="t" o:hr="t" fillcolor="#a0a0a0" stroked="f"/>
+          <v:rect id="_x0000_i1032" style="width:0;height:.75pt" o:hralign="center" o:hrstd="t" o:hr="t" fillcolor="#a0a0a0" stroked="f"/>
         </w:pict>
       </w:r>
     </w:p>
@@ -3232,235 +3009,61 @@
       </w:r>
     </w:p>
     <w:p>
-      <w:r>
-        <w:t>text</w:t>
+      <w:pPr>
+        <w:pStyle w:val="Heading3"/>
+      </w:pPr>
+      <w:r>
+        <w:t>8.2 Position Counting</w:t>
       </w:r>
     </w:p>
     <w:p>
       <w:r>
-        <w:t>┌─────────────────────────────────────┐</w:t>
+        <w:rPr>
+          <w:noProof/>
+        </w:rPr>
+        <w:drawing>
+          <wp:inline distT="0" distB="0" distL="0" distR="0" wp14:anchorId="4C4EF91C" wp14:editId="048A82EB">
+            <wp:extent cx="5943600" cy="2816225"/>
+            <wp:effectExtent l="0" t="0" r="0" b="3175"/>
+            <wp:docPr id="1962036485" name="Picture 3"/>
+            <wp:cNvGraphicFramePr>
+              <a:graphicFrameLocks xmlns:a="http://schemas.openxmlformats.org/drawingml/2006/main" noChangeAspect="1"/>
+            </wp:cNvGraphicFramePr>
+            <a:graphic xmlns:a="http://schemas.openxmlformats.org/drawingml/2006/main">
+              <a:graphicData uri="http://schemas.openxmlformats.org/drawingml/2006/picture">
+                <pic:pic xmlns:pic="http://schemas.openxmlformats.org/drawingml/2006/picture">
+                  <pic:nvPicPr>
+                    <pic:cNvPr id="1962036485" name="Picture 1962036485"/>
+                    <pic:cNvPicPr/>
+                  </pic:nvPicPr>
+                  <pic:blipFill>
+                    <a:blip r:embed="rId8" cstate="print">
+                      <a:extLst>
+                        <a:ext uri="{28A0092B-C50C-407E-A947-70E740481C1C}">
+                          <a14:useLocalDpi xmlns:a14="http://schemas.microsoft.com/office/drawing/2010/main" val="0"/>
+                        </a:ext>
+                      </a:extLst>
+                    </a:blip>
+                    <a:stretch>
+                      <a:fillRect/>
+                    </a:stretch>
+                  </pic:blipFill>
+                  <pic:spPr>
+                    <a:xfrm>
+                      <a:off x="0" y="0"/>
+                      <a:ext cx="5943600" cy="2816225"/>
+                    </a:xfrm>
+                    <a:prstGeom prst="rect">
+                      <a:avLst/>
+                    </a:prstGeom>
+                  </pic:spPr>
+                </pic:pic>
+              </a:graphicData>
+            </a:graphic>
+          </wp:inline>
+        </w:drawing>
       </w:r>
     </w:p>
-    <w:p>
-      <w:r>
-        <w:t>│     GLOBAL RISK MANAGER             │</w:t>
-      </w:r>
-    </w:p>
-    <w:p>
-      <w:proofErr w:type="gramStart"/>
-      <w:r>
-        <w:t>│  •</w:t>
-      </w:r>
-      <w:proofErr w:type="gramEnd"/>
-      <w:r>
-        <w:t xml:space="preserve"> Total daily loss limit           │</w:t>
-      </w:r>
-    </w:p>
-    <w:p>
-      <w:proofErr w:type="gramStart"/>
-      <w:r>
-        <w:t>│  •</w:t>
-      </w:r>
-      <w:proofErr w:type="gramEnd"/>
-      <w:r>
-        <w:t xml:space="preserve"> Max total positions (20)         │</w:t>
-      </w:r>
-    </w:p>
-    <w:p>
-      <w:proofErr w:type="gramStart"/>
-      <w:r>
-        <w:t>│  •</w:t>
-      </w:r>
-      <w:proofErr w:type="gramEnd"/>
-      <w:r>
-        <w:t xml:space="preserve"> Symbol blacklisting              │</w:t>
-      </w:r>
-    </w:p>
-    <w:p>
-      <w:r>
-        <w:t>└───────────────</w:t>
-      </w:r>
-      <w:r>
-        <w:rPr>
-          <w:rFonts w:ascii="MS Gothic" w:eastAsia="MS Gothic" w:hAnsi="MS Gothic" w:cs="MS Gothic" w:hint="eastAsia"/>
-        </w:rPr>
-        <w:t>┬</w:t>
-      </w:r>
-      <w:r>
-        <w:rPr>
-          <w:rFonts w:ascii="Aptos" w:hAnsi="Aptos" w:cs="Aptos"/>
-        </w:rPr>
-        <w:t>─────────────────────┘</w:t>
-      </w:r>
-    </w:p>
-    <w:p>
-      <w:r>
-        <w:t xml:space="preserve">                │</w:t>
-      </w:r>
-    </w:p>
-    <w:p>
-      <w:r>
-        <w:t xml:space="preserve">    ┌───────────</w:t>
-      </w:r>
-      <w:r>
-        <w:rPr>
-          <w:rFonts w:ascii="MS Gothic" w:eastAsia="MS Gothic" w:hAnsi="MS Gothic" w:cs="MS Gothic" w:hint="eastAsia"/>
-        </w:rPr>
-        <w:t>┼</w:t>
-      </w:r>
-      <w:r>
-        <w:rPr>
-          <w:rFonts w:ascii="Aptos" w:hAnsi="Aptos" w:cs="Aptos"/>
-        </w:rPr>
-        <w:t>───────────┐</w:t>
-      </w:r>
-    </w:p>
-    <w:p>
-      <w:r>
-        <w:t xml:space="preserve">    </w:t>
-      </w:r>
-      <w:r>
-        <w:rPr>
-          <w:rFonts w:ascii="Arial" w:hAnsi="Arial" w:cs="Arial"/>
-        </w:rPr>
-        <w:t>▼</w:t>
-      </w:r>
-      <w:r>
-        <w:t xml:space="preserve">           </w:t>
-      </w:r>
-      <w:r>
-        <w:rPr>
-          <w:rFonts w:ascii="Arial" w:hAnsi="Arial" w:cs="Arial"/>
-        </w:rPr>
-        <w:t>▼</w:t>
-      </w:r>
-      <w:r>
-        <w:t xml:space="preserve">           </w:t>
-      </w:r>
-      <w:r>
-        <w:rPr>
-          <w:rFonts w:ascii="Arial" w:hAnsi="Arial" w:cs="Arial"/>
-        </w:rPr>
-        <w:t>▼</w:t>
-      </w:r>
-    </w:p>
-    <w:p>
-      <w:r>
-        <w:t>┌───────┐  ┌───────┐  ┌───────┐</w:t>
-      </w:r>
-    </w:p>
-    <w:p>
-      <w:r>
-        <w:t xml:space="preserve">│ EMA   </w:t>
-      </w:r>
-      <w:proofErr w:type="gramStart"/>
-      <w:r>
-        <w:t>│  │</w:t>
-      </w:r>
-      <w:proofErr w:type="gramEnd"/>
-      <w:r>
-        <w:t xml:space="preserve"> PTS   </w:t>
-      </w:r>
-      <w:proofErr w:type="gramStart"/>
-      <w:r>
-        <w:t>│  │</w:t>
-      </w:r>
-      <w:proofErr w:type="gramEnd"/>
-      <w:r>
-        <w:t xml:space="preserve"> Future│</w:t>
-      </w:r>
-    </w:p>
-    <w:p>
-      <w:r>
-        <w:t xml:space="preserve">│ </w:t>
-      </w:r>
-      <w:proofErr w:type="gramStart"/>
-      <w:r>
-        <w:t>Risk  │</w:t>
-      </w:r>
-      <w:proofErr w:type="gramEnd"/>
-      <w:r>
-        <w:t xml:space="preserve">  │ </w:t>
-      </w:r>
-      <w:proofErr w:type="gramStart"/>
-      <w:r>
-        <w:t>Risk  │</w:t>
-      </w:r>
-      <w:proofErr w:type="gramEnd"/>
-      <w:r>
-        <w:t xml:space="preserve">  │ </w:t>
-      </w:r>
-      <w:proofErr w:type="gramStart"/>
-      <w:r>
-        <w:t>Risk  │</w:t>
-      </w:r>
-      <w:proofErr w:type="gramEnd"/>
-    </w:p>
-    <w:p>
-      <w:r>
-        <w:t>└───────┘  └───────┘  └───────┘</w:t>
-      </w:r>
-    </w:p>
-    <w:p>
-      <w:r>
-        <w:t xml:space="preserve">  • Daily     • Daily     • Daily</w:t>
-      </w:r>
-    </w:p>
-    <w:p>
-      <w:r>
-        <w:t xml:space="preserve">    loss       </w:t>
-      </w:r>
-      <w:proofErr w:type="spellStart"/>
-      <w:r>
-        <w:t>loss</w:t>
-      </w:r>
-      <w:proofErr w:type="spellEnd"/>
-      <w:r>
-        <w:t xml:space="preserve">       </w:t>
-      </w:r>
-      <w:proofErr w:type="spellStart"/>
-      <w:r>
-        <w:t>loss</w:t>
-      </w:r>
-      <w:proofErr w:type="spellEnd"/>
-    </w:p>
-    <w:p>
-      <w:r>
-        <w:t xml:space="preserve">  • Max       • Max       • Max</w:t>
-      </w:r>
-    </w:p>
-    <w:p>
-      <w:r>
-        <w:t xml:space="preserve">    </w:t>
-      </w:r>
-      <w:proofErr w:type="gramStart"/>
-      <w:r>
-        <w:t xml:space="preserve">positions  </w:t>
-      </w:r>
-      <w:proofErr w:type="spellStart"/>
-      <w:r>
-        <w:t>positions</w:t>
-      </w:r>
-      <w:proofErr w:type="spellEnd"/>
-      <w:proofErr w:type="gramEnd"/>
-      <w:r>
-        <w:t xml:space="preserve">  </w:t>
-      </w:r>
-      <w:proofErr w:type="spellStart"/>
-      <w:r>
-        <w:t>positions</w:t>
-      </w:r>
-      <w:proofErr w:type="spellEnd"/>
-    </w:p>
-    <w:p>
-      <w:pPr>
-        <w:pStyle w:val="Heading3"/>
-      </w:pPr>
-      <w:r>
-        <w:t>8.2 Position Counting</w:t>
-      </w:r>
-    </w:p>
-    <w:p/>
     <w:p>
       <w:r>
         <w:t>// Per Strategy: Count by magic number</w:t>
@@ -3531,7 +3134,6 @@
     <w:p/>
     <w:p>
       <w:r>
-        <w:lastRenderedPageBreak/>
         <w:t>// Global: Sum of all strategies</w:t>
       </w:r>
     </w:p>
@@ -3660,8 +3262,9 @@
     </w:p>
     <w:p>
       <w:r>
+        <w:lastRenderedPageBreak/>
         <w:pict w14:anchorId="2439075F">
-          <v:rect id="_x0000_i1129" style="width:0;height:.75pt" o:hralign="center" o:hrstd="t" o:hr="t" fillcolor="#a0a0a0" stroked="f"/>
+          <v:rect id="_x0000_i1033" style="width:0;height:.75pt" o:hralign="center" o:hrstd="t" o:hr="t" fillcolor="#a0a0a0" stroked="f"/>
         </w:pict>
       </w:r>
     </w:p>
@@ -3681,185 +3284,176 @@
         <w:t>9.1 Initialization Sequence</w:t>
       </w:r>
     </w:p>
+    <w:p/>
     <w:p>
-      <w:r>
-        <w:t>mql5</w:t>
+      <w:proofErr w:type="spellStart"/>
+      <w:proofErr w:type="gramStart"/>
+      <w:r>
+        <w:t>OnInit</w:t>
+      </w:r>
+      <w:proofErr w:type="spellEnd"/>
+      <w:r>
+        <w:t>(</w:t>
+      </w:r>
+      <w:proofErr w:type="gramEnd"/>
+      <w:r>
+        <w:t>)</w:t>
+      </w:r>
+    </w:p>
+    <w:p>
+      <w:r>
+        <w:t xml:space="preserve">    ↓</w:t>
+      </w:r>
+    </w:p>
+    <w:p>
+      <w:r>
+        <w:t xml:space="preserve">Load </w:t>
+      </w:r>
+      <w:proofErr w:type="spellStart"/>
+      <w:r>
+        <w:t>SymbolList.mqh</w:t>
+      </w:r>
+      <w:proofErr w:type="spellEnd"/>
+    </w:p>
+    <w:p>
+      <w:r>
+        <w:t xml:space="preserve">    ↓</w:t>
+      </w:r>
+    </w:p>
+    <w:p>
+      <w:r>
+        <w:t xml:space="preserve">Initialize </w:t>
+      </w:r>
+      <w:proofErr w:type="spellStart"/>
+      <w:r>
+        <w:t>TradeLogger</w:t>
+      </w:r>
+      <w:proofErr w:type="spellEnd"/>
+    </w:p>
+    <w:p>
+      <w:r>
+        <w:t xml:space="preserve">    ↓</w:t>
+      </w:r>
+    </w:p>
+    <w:p>
+      <w:r>
+        <w:t xml:space="preserve">Initialize </w:t>
+      </w:r>
+      <w:proofErr w:type="spellStart"/>
+      <w:r>
+        <w:t>StrategyManager</w:t>
+      </w:r>
+      <w:proofErr w:type="spellEnd"/>
+    </w:p>
+    <w:p>
+      <w:r>
+        <w:t xml:space="preserve">    ↓</w:t>
+      </w:r>
+    </w:p>
+    <w:p>
+      <w:r>
+        <w:t xml:space="preserve">IF </w:t>
+      </w:r>
+      <w:proofErr w:type="spellStart"/>
+      <w:proofErr w:type="gramStart"/>
+      <w:r>
+        <w:t>Enable</w:t>
+      </w:r>
+      <w:proofErr w:type="gramEnd"/>
+      <w:r>
+        <w:t>_EMA_Strategy</w:t>
+      </w:r>
+      <w:proofErr w:type="spellEnd"/>
+      <w:r>
+        <w:t xml:space="preserve"> → Load </w:t>
+      </w:r>
+      <w:proofErr w:type="spellStart"/>
+      <w:r>
+        <w:t>EMAStrategy</w:t>
+      </w:r>
+      <w:proofErr w:type="spellEnd"/>
+    </w:p>
+    <w:p>
+      <w:r>
+        <w:t xml:space="preserve">    ↓</w:t>
+      </w:r>
+    </w:p>
+    <w:p>
+      <w:r>
+        <w:t xml:space="preserve">IF </w:t>
+      </w:r>
+      <w:proofErr w:type="spellStart"/>
+      <w:r>
+        <w:t>Enable_PTS_Strategy</w:t>
+      </w:r>
+      <w:proofErr w:type="spellEnd"/>
+      <w:r>
+        <w:t xml:space="preserve"> → Load </w:t>
+      </w:r>
+      <w:proofErr w:type="spellStart"/>
+      <w:r>
+        <w:t>PTSStrategy</w:t>
+      </w:r>
+      <w:proofErr w:type="spellEnd"/>
+    </w:p>
+    <w:p>
+      <w:r>
+        <w:t xml:space="preserve">    ↓</w:t>
+      </w:r>
+    </w:p>
+    <w:p>
+      <w:r>
+        <w:t>Set Timer (</w:t>
+      </w:r>
+      <w:proofErr w:type="spellStart"/>
+      <w:r>
+        <w:t>ScanIntervalSeconds</w:t>
+      </w:r>
+      <w:proofErr w:type="spellEnd"/>
+      <w:r>
+        <w:t>)</w:t>
+      </w:r>
+    </w:p>
+    <w:p>
+      <w:r>
+        <w:t xml:space="preserve">    ↓</w:t>
+      </w:r>
+    </w:p>
+    <w:p>
+      <w:r>
+        <w:t>Start Strategies</w:t>
+      </w:r>
+    </w:p>
+    <w:p>
+      <w:r>
+        <w:t>9.2 Timer Execution Flow</w:t>
+      </w:r>
+    </w:p>
+    <w:p/>
+    <w:p>
+      <w:proofErr w:type="spellStart"/>
+      <w:proofErr w:type="gramStart"/>
+      <w:r>
+        <w:t>OnTimer</w:t>
+      </w:r>
+      <w:proofErr w:type="spellEnd"/>
+      <w:r>
+        <w:t>(</w:t>
+      </w:r>
+      <w:proofErr w:type="gramEnd"/>
+      <w:r>
+        <w:t>)</w:t>
+      </w:r>
+    </w:p>
+    <w:p>
+      <w:r>
+        <w:t xml:space="preserve">    ↓</w:t>
       </w:r>
     </w:p>
     <w:p>
       <w:proofErr w:type="spellStart"/>
       <w:proofErr w:type="gramStart"/>
       <w:r>
-        <w:t>OnInit</w:t>
-      </w:r>
-      <w:proofErr w:type="spellEnd"/>
-      <w:r>
-        <w:t>(</w:t>
-      </w:r>
-      <w:proofErr w:type="gramEnd"/>
-      <w:r>
-        <w:t>)</w:t>
-      </w:r>
-    </w:p>
-    <w:p>
-      <w:r>
-        <w:t xml:space="preserve">    ↓</w:t>
-      </w:r>
-    </w:p>
-    <w:p>
-      <w:r>
-        <w:t xml:space="preserve">Load </w:t>
-      </w:r>
-      <w:proofErr w:type="spellStart"/>
-      <w:r>
-        <w:t>SymbolList.mqh</w:t>
-      </w:r>
-      <w:proofErr w:type="spellEnd"/>
-    </w:p>
-    <w:p>
-      <w:r>
-        <w:t xml:space="preserve">    ↓</w:t>
-      </w:r>
-    </w:p>
-    <w:p>
-      <w:r>
-        <w:t xml:space="preserve">Initialize </w:t>
-      </w:r>
-      <w:proofErr w:type="spellStart"/>
-      <w:r>
-        <w:t>TradeLogger</w:t>
-      </w:r>
-      <w:proofErr w:type="spellEnd"/>
-    </w:p>
-    <w:p>
-      <w:r>
-        <w:t xml:space="preserve">    ↓</w:t>
-      </w:r>
-    </w:p>
-    <w:p>
-      <w:r>
-        <w:t xml:space="preserve">Initialize </w:t>
-      </w:r>
-      <w:proofErr w:type="spellStart"/>
-      <w:r>
-        <w:t>StrategyManager</w:t>
-      </w:r>
-      <w:proofErr w:type="spellEnd"/>
-    </w:p>
-    <w:p>
-      <w:r>
-        <w:t xml:space="preserve">    ↓</w:t>
-      </w:r>
-    </w:p>
-    <w:p>
-      <w:r>
-        <w:t xml:space="preserve">IF </w:t>
-      </w:r>
-      <w:proofErr w:type="spellStart"/>
-      <w:proofErr w:type="gramStart"/>
-      <w:r>
-        <w:t>Enable</w:t>
-      </w:r>
-      <w:proofErr w:type="gramEnd"/>
-      <w:r>
-        <w:t>_EMA_Strategy</w:t>
-      </w:r>
-      <w:proofErr w:type="spellEnd"/>
-      <w:r>
-        <w:t xml:space="preserve"> → Load </w:t>
-      </w:r>
-      <w:proofErr w:type="spellStart"/>
-      <w:r>
-        <w:t>EMAStrategy</w:t>
-      </w:r>
-      <w:proofErr w:type="spellEnd"/>
-    </w:p>
-    <w:p>
-      <w:r>
-        <w:t xml:space="preserve">    ↓</w:t>
-      </w:r>
-    </w:p>
-    <w:p>
-      <w:r>
-        <w:t xml:space="preserve">IF </w:t>
-      </w:r>
-      <w:proofErr w:type="spellStart"/>
-      <w:r>
-        <w:t>Enable_PTS_Strategy</w:t>
-      </w:r>
-      <w:proofErr w:type="spellEnd"/>
-      <w:r>
-        <w:t xml:space="preserve"> → Load </w:t>
-      </w:r>
-      <w:proofErr w:type="spellStart"/>
-      <w:r>
-        <w:t>PTSStrategy</w:t>
-      </w:r>
-      <w:proofErr w:type="spellEnd"/>
-    </w:p>
-    <w:p>
-      <w:r>
-        <w:t xml:space="preserve">    ↓</w:t>
-      </w:r>
-    </w:p>
-    <w:p>
-      <w:r>
-        <w:t>Set Timer (</w:t>
-      </w:r>
-      <w:proofErr w:type="spellStart"/>
-      <w:r>
-        <w:t>ScanIntervalSeconds</w:t>
-      </w:r>
-      <w:proofErr w:type="spellEnd"/>
-      <w:r>
-        <w:t>)</w:t>
-      </w:r>
-    </w:p>
-    <w:p>
-      <w:r>
-        <w:lastRenderedPageBreak/>
-        <w:t xml:space="preserve">    ↓</w:t>
-      </w:r>
-    </w:p>
-    <w:p>
-      <w:r>
-        <w:t>Start Strategies</w:t>
-      </w:r>
-    </w:p>
-    <w:p>
-      <w:r>
-        <w:t>9.2 Timer Execution Flow</w:t>
-      </w:r>
-    </w:p>
-    <w:p>
-      <w:r>
-        <w:t>mql5</w:t>
-      </w:r>
-    </w:p>
-    <w:p>
-      <w:proofErr w:type="spellStart"/>
-      <w:proofErr w:type="gramStart"/>
-      <w:r>
-        <w:t>OnTimer</w:t>
-      </w:r>
-      <w:proofErr w:type="spellEnd"/>
-      <w:r>
-        <w:t>(</w:t>
-      </w:r>
-      <w:proofErr w:type="gramEnd"/>
-      <w:r>
-        <w:t>)</w:t>
-      </w:r>
-    </w:p>
-    <w:p>
-      <w:r>
-        <w:t xml:space="preserve">    ↓</w:t>
-      </w:r>
-    </w:p>
-    <w:p>
-      <w:proofErr w:type="spellStart"/>
-      <w:proofErr w:type="gramStart"/>
-      <w:r>
         <w:t>StrategyManager</w:t>
       </w:r>
       <w:proofErr w:type="gramEnd"/>
@@ -3912,6 +3506,7 @@
     </w:p>
     <w:p>
       <w:r>
+        <w:lastRenderedPageBreak/>
         <w:t>│   └── Create QualifiedPairs.csv</w:t>
       </w:r>
     </w:p>
@@ -4041,7 +3636,6 @@
     </w:p>
     <w:p>
       <w:r>
-        <w:lastRenderedPageBreak/>
         <w:t xml:space="preserve">    ↓</w:t>
       </w:r>
     </w:p>
@@ -4078,7 +3672,7 @@
     <w:p>
       <w:r>
         <w:pict w14:anchorId="3ADC8BB2">
-          <v:rect id="_x0000_i1130" style="width:0;height:.75pt" o:hralign="center" o:hrstd="t" o:hr="t" fillcolor="#a0a0a0" stroked="f"/>
+          <v:rect id="_x0000_i1034" style="width:0;height:.75pt" o:hralign="center" o:hrstd="t" o:hr="t" fillcolor="#a0a0a0" stroked="f"/>
         </w:pict>
       </w:r>
     </w:p>
@@ -4087,6 +3681,7 @@
         <w:pStyle w:val="Heading2"/>
       </w:pPr>
       <w:r>
+        <w:lastRenderedPageBreak/>
         <w:t>10. ERROR HANDLING</w:t>
       </w:r>
     </w:p>
@@ -4462,7 +4057,7 @@
     <w:p>
       <w:r>
         <w:pict w14:anchorId="39E810BE">
-          <v:rect id="_x0000_i1131" style="width:0;height:.75pt" o:hralign="center" o:hrstd="t" o:hr="t" fillcolor="#a0a0a0" stroked="f"/>
+          <v:rect id="_x0000_i1035" style="width:0;height:.75pt" o:hralign="center" o:hrstd="t" o:hr="t" fillcolor="#a0a0a0" stroked="f"/>
         </w:pict>
       </w:r>
     </w:p>
@@ -4471,7 +4066,6 @@
         <w:pStyle w:val="Heading2"/>
       </w:pPr>
       <w:r>
-        <w:lastRenderedPageBreak/>
         <w:t>11. PERFORMANCE MONITORING</w:t>
       </w:r>
     </w:p>
@@ -4585,6 +4179,7 @@
     </w:p>
     <w:p>
       <w:r>
+        <w:lastRenderedPageBreak/>
         <w:t xml:space="preserve">    double </w:t>
       </w:r>
       <w:proofErr w:type="spellStart"/>
@@ -4740,7 +4335,6 @@
     </w:p>
     <w:p>
       <w:r>
-        <w:lastRenderedPageBreak/>
         <w:t>Daily P&amp;L: EMA: +$45 | PTS: $0</w:t>
       </w:r>
     </w:p>
@@ -4762,7 +4356,7 @@
     <w:p>
       <w:r>
         <w:pict w14:anchorId="16D72424">
-          <v:rect id="_x0000_i1132" style="width:0;height:.75pt" o:hralign="center" o:hrstd="t" o:hr="t" fillcolor="#a0a0a0" stroked="f"/>
+          <v:rect id="_x0000_i1036" style="width:0;height:.75pt" o:hralign="center" o:hrstd="t" o:hr="t" fillcolor="#a0a0a0" stroked="f"/>
         </w:pict>
       </w:r>
     </w:p>
@@ -4812,6 +4406,7 @@
         </w:numPr>
       </w:pPr>
       <w:r>
+        <w:lastRenderedPageBreak/>
         <w:t>Toggle System: Verify enable/disable functionality</w:t>
       </w:r>
     </w:p>
@@ -5241,7 +4836,7 @@
     <w:p>
       <w:r>
         <w:pict w14:anchorId="569227C2">
-          <v:rect id="_x0000_i1133" style="width:0;height:.75pt" o:hralign="center" o:hrstd="t" o:hr="t" fillcolor="#a0a0a0" stroked="f"/>
+          <v:rect id="_x0000_i1037" style="width:0;height:.75pt" o:hralign="center" o:hrstd="t" o:hr="t" fillcolor="#a0a0a0" stroked="f"/>
         </w:pict>
       </w:r>
     </w:p>
@@ -5250,7 +4845,6 @@
         <w:pStyle w:val="Heading2"/>
       </w:pPr>
       <w:r>
-        <w:lastRenderedPageBreak/>
         <w:t>13. MIGRATION PATH</w:t>
       </w:r>
     </w:p>
@@ -5403,6 +4997,7 @@
         </w:numPr>
       </w:pPr>
       <w:r>
+        <w:lastRenderedPageBreak/>
         <w:t>Add toggle system to Solara.mq5</w:t>
       </w:r>
     </w:p>
@@ -5574,9 +5169,8 @@
     </w:p>
     <w:p>
       <w:r>
-        <w:lastRenderedPageBreak/>
         <w:pict w14:anchorId="400C1D89">
-          <v:rect id="_x0000_i1134" style="width:0;height:.75pt" o:hralign="center" o:hrstd="t" o:hr="t" fillcolor="#a0a0a0" stroked="f"/>
+          <v:rect id="_x0000_i1038" style="width:0;height:.75pt" o:hralign="center" o:hrstd="t" o:hr="t" fillcolor="#a0a0a0" stroked="f"/>
         </w:pict>
       </w:r>
     </w:p>
@@ -5675,6 +5269,7 @@
         <w:pStyle w:val="Heading3"/>
       </w:pPr>
       <w:r>
+        <w:lastRenderedPageBreak/>
         <w:t>14.2 Performance Requirements</w:t>
       </w:r>
     </w:p>
@@ -5782,7 +5377,7 @@
     <w:p>
       <w:r>
         <w:pict w14:anchorId="2BD5E55D">
-          <v:rect id="_x0000_i1135" style="width:0;height:.75pt" o:hralign="center" o:hrstd="t" o:hr="t" fillcolor="#a0a0a0" stroked="f"/>
+          <v:rect id="_x0000_i1039" style="width:0;height:.75pt" o:hralign="center" o:hrstd="t" o:hr="t" fillcolor="#a0a0a0" stroked="f"/>
         </w:pict>
       </w:r>
     </w:p>
@@ -5909,7 +5504,6 @@
           </w:tcPr>
           <w:p>
             <w:r>
-              <w:lastRenderedPageBreak/>
               <w:t>PTS Strategy</w:t>
             </w:r>
           </w:p>
@@ -6127,7 +5721,7 @@
     <w:p>
       <w:r>
         <w:pict w14:anchorId="47CCFD65">
-          <v:rect id="_x0000_i1136" style="width:0;height:.75pt" o:hralign="center" o:hrstd="t" o:hr="t" fillcolor="#a0a0a0" stroked="f"/>
+          <v:rect id="_x0000_i1040" style="width:0;height:.75pt" o:hralign="center" o:hrstd="t" o:hr="t" fillcolor="#a0a0a0" stroked="f"/>
         </w:pict>
       </w:r>
     </w:p>
@@ -6136,6 +5730,7 @@
         <w:pStyle w:val="Heading2"/>
       </w:pPr>
       <w:r>
+        <w:lastRenderedPageBreak/>
         <w:t>16. APPENDICES</w:t>
       </w:r>
     </w:p>
@@ -35773,6 +35368,7 @@
   <w:style w:type="character" w:default="1" w:styleId="DefaultParagraphFont">
     <w:name w:val="Default Paragraph Font"/>
     <w:uiPriority w:val="1"/>
+    <w:semiHidden/>
     <w:unhideWhenUsed/>
   </w:style>
   <w:style w:type="table" w:default="1" w:styleId="TableNormal">

</xml_diff>